<commit_message>
chore: commit current working-tree changes
- Scrapling-powered job URL import: stealthy Fetcher fetch + adaptive parse, with safe heuristic fallback

- Pin scrapling[fetchers]==0.4.14; document optional browser-install step in Dockerfiles

- Reconcile backend_arch.txt and API/Frontend docx with the actual code

- Add PRODUCT_DIRECTION.md (direction, Scrapling plan, free tooling) and IMPLEMENTATION_STATUS.md

- Frontend: same-origin API base (fixes 401) and Vite HMR config

- Includes prior working-tree edits to auth, jobs, users, stats, agent_api (ARCHITECTURE_MAP.md moved to docs/)
</commit_message>
<xml_diff>
--- a/docs/Frontend Design.docx
+++ b/docs/Frontend Design.docx
@@ -4559,11 +4559,7 @@
         </w:rPr>
       </w:pPr>
       <w:r>
-        <w:rPr>
-          <w:b/>
-          <w:bCs/>
-        </w:rPr>
-        <w:t>Why Next.js App Router</w:t>
+        <w:t>Why TanStack Router (file-based routes) + TanStack Start (SSR) + Vite</w:t>
       </w:r>
     </w:p>
     <w:p>
@@ -7132,6 +7128,11 @@
     </w:p>
     <w:p/>
     <w:p/>
+    <w:p>
+      <w:r>
+        <w:t>As-built note (2026-08-22): the framework is TanStack Router + TanStack Start + Vite (NOT Next.js). This matches SIRAFIT_OVERVIEW.md and the actual frontend source. See docs/IMPLEMENTATION_STATUS.md.</w:t>
+      </w:r>
+    </w:p>
     <w:sectPr>
       <w:pgSz w:w="12240" w:h="15840"/>
       <w:pgMar w:top="1440" w:right="1440" w:bottom="1440" w:left="1440" w:header="720" w:footer="720" w:gutter="0"/>

</xml_diff>